<commit_message>
Add project description to report
</commit_message>
<xml_diff>
--- a/OSS_Audit_Report_24MEI10050_HUMANIZED.docx
+++ b/OSS_Audit_Report_24MEI10050_HUMANIZED.docx
@@ -41,6 +41,11 @@
       <w:r>
         <w:t>Chosen Software: Python</w:t>
         <w:br/>
+      </w:r>
+    </w:p>
+    <w:p>
+      <w:r>
+        <w:t>This is my submission for the Open Source Audit Capstone Project. I audited Python, exploring its problem-solving origins, the PSF permissive license, and its ethical FOSS standing. The submission includes a detailed report comparing Python to proprietary alternatives (like MATLAB), alongside 5 practical Linux bash scripts demonstrating system auditing, package inspection, log analysis, and interactive manifesto generation.</w:t>
       </w:r>
     </w:p>
     <w:p>

</xml_diff>